<commit_message>
Abschluss M7: Funkraum mit fünf Szenarien, Werkstatt und Knack-Arena, Abzeichen, e2e 5 und 6
Co-Authored-By: Claude Opus 5.5 <noreply@anthropic.com>
Claude-Session: https://claude.ai/code/session_01JKXVQqFeKVmyQ9jfHw4db3
</commit_message>
<xml_diff>
--- a/materialien/Werkzeuge/Funkraum/KR_W5_Funkraum_Mallory_im_Netz.docx
+++ b/materialien/Werkzeuge/Funkraum/KR_W5_Funkraum_Mallory_im_Netz.docx
@@ -169,7 +169,7 @@
               <w:rPr>
                 <w:rFonts w:ascii="Georgia" w:hAnsi="Georgia" w:cs="Georgia" w:eastAsia="Georgia"/>
                 <w:b/>
-                <w:color w:val="0E7C86"/>
+                <w:color w:val="14213D"/>
                 <w:sz w:val="34"/>
               </w:rPr>
               <w:t>Mallory im Netz</w:t>
@@ -246,7 +246,7 @@
               <w:rPr>
                 <w:rFonts w:ascii="Georgia" w:hAnsi="Georgia" w:cs="Georgia" w:eastAsia="Georgia"/>
                 <w:b/>
-                <w:color w:val="0E7C86"/>
+                <w:color w:val="14213D"/>
                 <w:spacing w:val="16"/>
                 <w:sz w:val="21"/>
               </w:rPr>
@@ -3570,7 +3570,7 @@
                 <w:color w:val="1B1B1F"/>
                 <w:sz w:val="20"/>
               </w:rPr>
-              <w:t>Team Polybios</w:t>
+              <w:t>Team Quadrat</w:t>
             </w:r>
           </w:p>
         </w:tc>
@@ -3682,7 +3682,7 @@
                 <w:color w:val="1B1B1F"/>
                 <w:sz w:val="20"/>
               </w:rPr>
-              <w:t>Team Kasiski</w:t>
+              <w:t>Team Lochstreifen</w:t>
             </w:r>
           </w:p>
         </w:tc>

</xml_diff>